<commit_message>
Make looke more like existing documentation
</commit_message>
<xml_diff>
--- a/Documentation/Test descriptions/Version 4.1/Brugervejledning for IBOS Punktnodelæser.v4.1.docx
+++ b/Documentation/Test descriptions/Version 4.1/Brugervejledning for IBOS Punktnodelæser.v4.1.docx
@@ -7,6 +7,25 @@
         <w:pStyle w:val="Titel"/>
         <w:spacing w:before="240" w:after="120"/>
         <w:rPr>
+          <w:rFonts w:ascii="Verdana" w:hAnsi="Verdana"/>
+          <w:sz w:val="48"/>
+          <w:szCs w:val="48"/>
+        </w:rPr>
+      </w:pPr>
+      <w:r>
+        <w:rPr>
+          <w:rFonts w:ascii="Verdana" w:hAnsi="Verdana"/>
+          <w:sz w:val="48"/>
+          <w:szCs w:val="48"/>
+        </w:rPr>
+        <w:t>Brugervejledning for</w:t>
+      </w:r>
+    </w:p>
+    <w:p>
+      <w:pPr>
+        <w:pStyle w:val="Titel"/>
+        <w:spacing w:before="240" w:after="120"/>
+        <w:rPr>
           <w:b/>
           <w:b/>
           <w:bCs/>
@@ -14,10 +33,19 @@
       </w:pPr>
       <w:r>
         <w:rPr>
-          <w:sz w:val="44"/>
-          <w:szCs w:val="44"/>
-        </w:rPr>
-        <w:t>Brugervejledning for IBOS Punktnodelæser Version 4.1</w:t>
+          <w:rFonts w:ascii="Verdana" w:hAnsi="Verdana"/>
+          <w:sz w:val="48"/>
+          <w:szCs w:val="48"/>
+        </w:rPr>
+        <w:t xml:space="preserve"> </w:t>
+      </w:r>
+      <w:r>
+        <w:rPr>
+          <w:rFonts w:ascii="Verdana" w:hAnsi="Verdana"/>
+          <w:sz w:val="48"/>
+          <w:szCs w:val="48"/>
+        </w:rPr>
+        <w:t>IBOS Punktnodelæser Version 4.1</w:t>
       </w:r>
     </w:p>
     <w:p>
@@ -35,483 +63,1239 @@
     <w:p>
       <w:pPr>
         <w:pStyle w:val="Overskrift1"/>
-        <w:rPr/>
-      </w:pPr>
-      <w:r>
-        <w:rPr/>
-        <w:t>Funktionsbeskrivelse</w:t>
-      </w:r>
-    </w:p>
-    <w:p>
-      <w:pPr>
-        <w:pStyle w:val="Prformaterettekst"/>
-        <w:bidi w:val="0"/>
-        <w:spacing w:before="0" w:after="0"/>
-        <w:jc w:val="left"/>
-        <w:rPr/>
-      </w:pPr>
-      <w:r>
-        <w:rPr/>
-      </w:r>
-    </w:p>
-    <w:p>
-      <w:pPr>
-        <w:pStyle w:val="Prformaterettekst"/>
-        <w:bidi w:val="0"/>
-        <w:spacing w:before="0" w:after="0"/>
-        <w:jc w:val="left"/>
-        <w:rPr/>
-      </w:pPr>
-      <w:r>
-        <w:rPr/>
+        <w:numPr>
+          <w:ilvl w:val="0"/>
+          <w:numId w:val="2"/>
+        </w:numPr>
+        <w:rPr>
+          <w:rFonts w:ascii="Verdana" w:hAnsi="Verdana"/>
+        </w:rPr>
+      </w:pPr>
+      <w:r>
+        <w:rPr>
+          <w:rFonts w:ascii="Verdana" w:hAnsi="Verdana"/>
+        </w:rPr>
+        <w:t>Grundlæggende principper</w:t>
+      </w:r>
+    </w:p>
+    <w:p>
+      <w:pPr>
+        <w:pStyle w:val="Brdtekst"/>
+        <w:rPr>
+          <w:rFonts w:ascii="Verdana" w:hAnsi="Verdana"/>
+        </w:rPr>
+      </w:pPr>
+      <w:r>
+        <w:rPr>
+          <w:rFonts w:ascii="Verdana" w:hAnsi="Verdana"/>
+        </w:rPr>
+      </w:r>
+    </w:p>
+    <w:p>
+      <w:pPr>
+        <w:pStyle w:val="Brdtekst"/>
+        <w:rPr>
+          <w:rFonts w:ascii="Verdana" w:hAnsi="Verdana"/>
+        </w:rPr>
+      </w:pPr>
+      <w:r>
+        <w:rPr>
+          <w:rFonts w:ascii="Verdana" w:hAnsi="Verdana"/>
+        </w:rPr>
         <w:t>IBOS Punktnodelæser er et midlertidigt, selvstændigt PC-program til brug ved den indledende test af fortolkning af punktnoder i IBOS Nodelæser. Det er tanken at programmets funktion senere vil blive integreret ind i IBOS Nodelæser.</w:t>
       </w:r>
     </w:p>
     <w:p>
       <w:pPr>
-        <w:pStyle w:val="Prformaterettekst"/>
-        <w:bidi w:val="0"/>
-        <w:spacing w:before="0" w:after="0"/>
-        <w:jc w:val="left"/>
-        <w:rPr/>
-      </w:pPr>
-      <w:r>
-        <w:rPr/>
-      </w:r>
-    </w:p>
-    <w:p>
-      <w:pPr>
-        <w:pStyle w:val="Prformaterettekst"/>
-        <w:bidi w:val="0"/>
-        <w:spacing w:before="0" w:after="0"/>
-        <w:jc w:val="left"/>
-        <w:rPr/>
-      </w:pPr>
-      <w:r>
-        <w:rPr/>
-        <w:t>Principperne for brugergrænsefladen i IBOS Punktnodelæser er derfor præcis de samme som i IBOS Nodelæser:</w:t>
-      </w:r>
-    </w:p>
-    <w:p>
-      <w:pPr>
-        <w:pStyle w:val="Prformaterettekst"/>
-        <w:bidi w:val="0"/>
-        <w:spacing w:before="0" w:after="0"/>
-        <w:jc w:val="left"/>
-        <w:rPr/>
-      </w:pPr>
-      <w:r>
-        <w:rPr/>
-      </w:r>
-    </w:p>
-    <w:p>
-      <w:pPr>
-        <w:pStyle w:val="Prformaterettekst"/>
-        <w:bidi w:val="0"/>
-        <w:spacing w:before="0" w:after="0"/>
-        <w:jc w:val="left"/>
-        <w:rPr/>
-      </w:pPr>
-      <w:r>
-        <w:rPr/>
-        <w:t>Brugergrænsefladen består i hovedtrækkene af 3 almindelige Windows Forms kontroller:</w:t>
-      </w:r>
-    </w:p>
-    <w:p>
-      <w:pPr>
-        <w:pStyle w:val="Prformaterettekst"/>
-        <w:bidi w:val="0"/>
-        <w:spacing w:before="0" w:after="0"/>
-        <w:jc w:val="left"/>
-        <w:rPr/>
-      </w:pPr>
-      <w:r>
-        <w:rPr/>
-      </w:r>
-    </w:p>
-    <w:p>
-      <w:pPr>
-        <w:pStyle w:val="Prformaterettekst"/>
-        <w:bidi w:val="0"/>
-        <w:spacing w:before="0" w:after="0"/>
-        <w:jc w:val="left"/>
-        <w:rPr>
-          <w:b/>
-          <w:b/>
-          <w:bCs/>
-        </w:rPr>
-      </w:pPr>
-      <w:r>
-        <w:rPr>
-          <w:b/>
-          <w:bCs/>
-        </w:rPr>
-        <w:t>En menu:</w:t>
-      </w:r>
-    </w:p>
-    <w:p>
-      <w:pPr>
-        <w:pStyle w:val="Prformaterettekst"/>
-        <w:bidi w:val="0"/>
-        <w:spacing w:before="0" w:after="0"/>
-        <w:jc w:val="left"/>
-        <w:rPr/>
-      </w:pPr>
-      <w:r>
-        <w:rPr/>
-        <w:t>Indeholder menupunkter for indlæsning af punktnodefiler samt for eksport af genererede  MusicXml filer.</w:t>
-      </w:r>
-    </w:p>
-    <w:p>
-      <w:pPr>
-        <w:pStyle w:val="Prformaterettekst"/>
-        <w:bidi w:val="0"/>
-        <w:spacing w:before="0" w:after="0"/>
-        <w:jc w:val="left"/>
-        <w:rPr/>
-      </w:pPr>
-      <w:r>
-        <w:rPr/>
-      </w:r>
-    </w:p>
-    <w:p>
-      <w:pPr>
-        <w:pStyle w:val="Prformaterettekst"/>
-        <w:bidi w:val="0"/>
-        <w:spacing w:before="0" w:after="0"/>
-        <w:jc w:val="left"/>
-        <w:rPr>
-          <w:b/>
-          <w:b/>
-          <w:bCs/>
-        </w:rPr>
-      </w:pPr>
-      <w:r>
-        <w:rPr>
-          <w:b/>
-          <w:bCs/>
-        </w:rPr>
-        <w:t>En nodeliste:</w:t>
-      </w:r>
-    </w:p>
-    <w:p>
-      <w:pPr>
-        <w:pStyle w:val="Prformaterettekst"/>
-        <w:bidi w:val="0"/>
-        <w:spacing w:before="0" w:after="0"/>
-        <w:jc w:val="left"/>
-        <w:rPr/>
-      </w:pPr>
-      <w:r>
-        <w:rPr/>
-        <w:t>Indeholder den indlæste punktnode-fil, oversat til en simpel tekstrepræsentation.</w:t>
-      </w:r>
-    </w:p>
-    <w:p>
-      <w:pPr>
-        <w:pStyle w:val="Prformaterettekst"/>
-        <w:bidi w:val="0"/>
-        <w:spacing w:before="0" w:after="0"/>
-        <w:jc w:val="left"/>
-        <w:rPr/>
-      </w:pPr>
-      <w:r>
-        <w:rPr/>
-      </w:r>
-    </w:p>
-    <w:p>
-      <w:pPr>
-        <w:pStyle w:val="Prformaterettekst"/>
-        <w:bidi w:val="0"/>
-        <w:spacing w:before="0" w:after="0"/>
-        <w:jc w:val="left"/>
-        <w:rPr>
-          <w:b/>
-          <w:b/>
-          <w:bCs/>
-        </w:rPr>
-      </w:pPr>
-      <w:r>
-        <w:rPr>
-          <w:b/>
-          <w:bCs/>
-        </w:rPr>
-        <w:t>Et nodefilter:</w:t>
-      </w:r>
-    </w:p>
-    <w:p>
-      <w:pPr>
-        <w:pStyle w:val="Prformaterettekst"/>
-        <w:bidi w:val="0"/>
-        <w:spacing w:before="0" w:after="0"/>
-        <w:jc w:val="left"/>
-        <w:rPr/>
-      </w:pPr>
-      <w:r>
-        <w:rPr/>
-        <w:t>Tillader at brugeren at kontrollere hvilke detaljer, der vises i listbox’en.</w:t>
-      </w:r>
-    </w:p>
-    <w:p>
-      <w:pPr>
-        <w:pStyle w:val="Prformaterettekst"/>
-        <w:bidi w:val="0"/>
-        <w:spacing w:before="0" w:after="0"/>
-        <w:jc w:val="left"/>
-        <w:rPr/>
-      </w:pPr>
-      <w:r>
-        <w:rPr/>
-      </w:r>
-    </w:p>
-    <w:p>
-      <w:pPr>
-        <w:pStyle w:val="Prformaterettekst"/>
-        <w:bidi w:val="0"/>
-        <w:spacing w:before="0" w:after="0"/>
-        <w:jc w:val="left"/>
-        <w:rPr/>
-      </w:pPr>
-      <w:r>
-        <w:rPr/>
-        <w:t>Ved indlæsning og fortolkning af punktnodefiler vil der ofte optræde fejl, enten fordi der er fejl i punktnodefilen, eller fordi punktnodefilen indeholder konstruktioner, som  IBOS Punktnodelæser endnu ikke understøtter. I så fald vises efter indlæsning af punktnode-filen en medelelse, som opsummerer de fundne fejl.</w:t>
-      </w:r>
-    </w:p>
-    <w:p>
-      <w:pPr>
-        <w:pStyle w:val="Prformaterettekst"/>
-        <w:bidi w:val="0"/>
-        <w:spacing w:before="0" w:after="0"/>
-        <w:jc w:val="left"/>
-        <w:rPr/>
-      </w:pPr>
-      <w:r>
-        <w:rPr/>
-      </w:r>
-    </w:p>
-    <w:p>
-      <w:pPr>
-        <w:pStyle w:val="Prformaterettekst"/>
-        <w:bidi w:val="0"/>
-        <w:spacing w:before="0" w:after="0"/>
-        <w:jc w:val="left"/>
-        <w:rPr/>
-      </w:pPr>
-      <w:r>
-        <w:rPr/>
-        <w:t>Efter indlæsning og fortolkning af en punktnodefil vises dens indhold i en simpel tekstrepræsentation i listboxen:</w:t>
-      </w:r>
-    </w:p>
-    <w:p>
-      <w:pPr>
-        <w:pStyle w:val="Prformaterettekst"/>
-        <w:bidi w:val="0"/>
-        <w:spacing w:before="0" w:after="0"/>
-        <w:jc w:val="left"/>
-        <w:rPr/>
-      </w:pPr>
-      <w:r>
-        <w:rPr/>
-      </w:r>
-    </w:p>
-    <w:p>
-      <w:pPr>
-        <w:pStyle w:val="Prformaterettekst"/>
-        <w:bidi w:val="0"/>
-        <w:spacing w:before="0" w:after="0"/>
-        <w:jc w:val="left"/>
-        <w:rPr/>
-      </w:pPr>
-      <w:r>
-        <w:rPr/>
-        <w:t xml:space="preserve">For hver linje i punktnode-filen vises øverst en linje indeholdende: </w:t>
-      </w:r>
-    </w:p>
-    <w:p>
-      <w:pPr>
-        <w:pStyle w:val="Prformaterettekst"/>
-        <w:bidi w:val="0"/>
-        <w:spacing w:before="0" w:after="0"/>
-        <w:jc w:val="left"/>
-        <w:rPr/>
-      </w:pPr>
-      <w:r>
-        <w:rPr/>
+        <w:pStyle w:val="Brdtekst"/>
+        <w:rPr>
+          <w:rFonts w:ascii="Verdana" w:hAnsi="Verdana"/>
+        </w:rPr>
+      </w:pPr>
+      <w:r>
+        <w:rPr>
+          <w:rFonts w:ascii="Verdana" w:hAnsi="Verdana"/>
+        </w:rPr>
+        <w:t>Principperne for brugergrænsefladen i IBOS Punktnodelæser er derfor præcis de samme som i IBOS Nodelæser.</w:t>
+      </w:r>
+    </w:p>
+    <w:p>
+      <w:pPr>
+        <w:pStyle w:val="Brdtekst"/>
+        <w:rPr>
+          <w:rFonts w:ascii="Verdana" w:hAnsi="Verdana"/>
+        </w:rPr>
+      </w:pPr>
+      <w:r>
+        <w:rPr>
+          <w:rFonts w:cs="Verdana" w:ascii="Verdana" w:hAnsi="Verdana"/>
+          <w:color w:val="000000"/>
+        </w:rPr>
+        <w:t xml:space="preserve">IBOS </w:t>
+      </w:r>
+      <w:r>
+        <w:rPr>
+          <w:rFonts w:cs="Verdana" w:ascii="Verdana" w:hAnsi="Verdana"/>
+          <w:color w:val="000000"/>
+        </w:rPr>
+        <w:t>Punkt</w:t>
+      </w:r>
+      <w:r>
+        <w:rPr>
+          <w:rFonts w:cs="Verdana" w:ascii="Verdana" w:hAnsi="Verdana"/>
+          <w:color w:val="000000"/>
+        </w:rPr>
+        <w:t>n</w:t>
+      </w:r>
+      <w:r>
+        <w:rPr>
+          <w:rFonts w:cs="Verdana" w:ascii="Verdana" w:hAnsi="Verdana"/>
+          <w:color w:val="000000"/>
+        </w:rPr>
+        <w:t xml:space="preserve">odelæser er </w:t>
+      </w:r>
+      <w:r>
+        <w:rPr>
+          <w:rFonts w:cs="Verdana" w:ascii="Verdana" w:hAnsi="Verdana"/>
+          <w:color w:val="000000"/>
+        </w:rPr>
+        <w:t>således</w:t>
+      </w:r>
+      <w:r>
+        <w:rPr>
+          <w:rFonts w:cs="Verdana" w:ascii="Verdana" w:hAnsi="Verdana"/>
+          <w:color w:val="000000"/>
+        </w:rPr>
+        <w:t xml:space="preserve"> opbygget over </w:t>
+      </w:r>
+      <w:r>
+        <w:rPr>
+          <w:rFonts w:cs="Verdana" w:ascii="Verdana" w:hAnsi="Verdana"/>
+          <w:color w:val="000000"/>
+          <w:lang w:val="da-DK"/>
+        </w:rPr>
+        <w:t>fire</w:t>
+      </w:r>
+      <w:r>
+        <w:rPr>
+          <w:rFonts w:cs="Verdana" w:ascii="Verdana" w:hAnsi="Verdana"/>
+          <w:color w:val="000000"/>
+        </w:rPr>
+        <w:t xml:space="preserve"> kendte visnings-komponenter, som tilsammen tillader brugeren at åbne en </w:t>
+      </w:r>
+      <w:r>
+        <w:rPr>
+          <w:rFonts w:cs="Verdana" w:ascii="Verdana" w:hAnsi="Verdana"/>
+          <w:color w:val="000000"/>
+        </w:rPr>
+        <w:t>punktnodefil</w:t>
+      </w:r>
+      <w:r>
+        <w:rPr>
+          <w:rFonts w:cs="Verdana" w:ascii="Verdana" w:hAnsi="Verdana"/>
+          <w:color w:val="000000"/>
+        </w:rPr>
+        <w:t xml:space="preserve"> og navigere rundt i den. Disse</w:t>
+      </w:r>
+      <w:r>
+        <w:rPr>
+          <w:rFonts w:cs="Verdana" w:ascii="Verdana" w:hAnsi="Verdana"/>
+          <w:color w:val="000000"/>
+          <w:lang w:val="da-DK"/>
+        </w:rPr>
+        <w:t xml:space="preserve"> </w:t>
+      </w:r>
+      <w:r>
+        <w:rPr>
+          <w:rFonts w:cs="Verdana" w:ascii="Verdana" w:hAnsi="Verdana"/>
+          <w:color w:val="000000"/>
+        </w:rPr>
+        <w:t xml:space="preserve"> visnings-komponenter er:</w:t>
+      </w:r>
+    </w:p>
+    <w:tbl>
+      <w:tblPr>
+        <w:tblW w:w="9647" w:type="dxa"/>
+        <w:jc w:val="left"/>
+        <w:tblInd w:w="0" w:type="dxa"/>
+        <w:tblCellMar>
+          <w:top w:w="55" w:type="dxa"/>
+          <w:left w:w="55" w:type="dxa"/>
+          <w:bottom w:w="55" w:type="dxa"/>
+          <w:right w:w="55" w:type="dxa"/>
+        </w:tblCellMar>
+      </w:tblPr>
+      <w:tblGrid>
+        <w:gridCol w:w="2775"/>
+        <w:gridCol w:w="6871"/>
+      </w:tblGrid>
+      <w:tr>
+        <w:trPr/>
+        <w:tc>
+          <w:tcPr>
+            <w:tcW w:w="2775" w:type="dxa"/>
+            <w:tcBorders>
+              <w:top w:val="single" w:sz="2" w:space="0" w:color="000000"/>
+              <w:left w:val="single" w:sz="2" w:space="0" w:color="000000"/>
+              <w:bottom w:val="single" w:sz="2" w:space="0" w:color="000000"/>
+            </w:tcBorders>
+            <w:shd w:fill="auto" w:val="clear"/>
+          </w:tcPr>
+          <w:p>
+            <w:pPr>
+              <w:pStyle w:val="Brdtekst"/>
+              <w:spacing w:before="0" w:after="120"/>
+              <w:rPr/>
+            </w:pPr>
+            <w:r>
+              <w:rPr>
+                <w:rFonts w:cs="Verdana" w:ascii="Verdana" w:hAnsi="Verdana"/>
+                <w:b/>
+                <w:bCs/>
+                <w:color w:val="000000"/>
+              </w:rPr>
+              <w:t>Menulinien:</w:t>
+            </w:r>
+          </w:p>
+        </w:tc>
+        <w:tc>
+          <w:tcPr>
+            <w:tcW w:w="6871" w:type="dxa"/>
+            <w:tcBorders>
+              <w:top w:val="single" w:sz="2" w:space="0" w:color="000000"/>
+              <w:left w:val="single" w:sz="2" w:space="0" w:color="000000"/>
+              <w:bottom w:val="single" w:sz="2" w:space="0" w:color="000000"/>
+              <w:right w:val="single" w:sz="2" w:space="0" w:color="000000"/>
+            </w:tcBorders>
+            <w:shd w:fill="auto" w:val="clear"/>
+          </w:tcPr>
+          <w:p>
+            <w:pPr>
+              <w:pStyle w:val="Brdtekst"/>
+              <w:rPr/>
+            </w:pPr>
+            <w:r>
+              <w:rPr>
+                <w:rFonts w:cs="Verdana" w:ascii="Verdana" w:hAnsi="Verdana"/>
+                <w:color w:val="000000"/>
+              </w:rPr>
+              <w:t xml:space="preserve">Bruges primært til at </w:t>
+            </w:r>
+            <w:r>
+              <w:rPr>
+                <w:rFonts w:cs="Verdana" w:ascii="Verdana" w:hAnsi="Verdana"/>
+                <w:color w:val="000000"/>
+              </w:rPr>
+              <w:t xml:space="preserve">udvælge og </w:t>
+            </w:r>
+            <w:r>
+              <w:rPr>
+                <w:rFonts w:cs="Verdana" w:ascii="Verdana" w:hAnsi="Verdana"/>
+                <w:color w:val="000000"/>
+              </w:rPr>
+              <w:t xml:space="preserve">åbne </w:t>
+            </w:r>
+            <w:r>
+              <w:rPr>
+                <w:rFonts w:cs="Verdana" w:ascii="Verdana" w:hAnsi="Verdana"/>
+                <w:color w:val="000000"/>
+              </w:rPr>
+              <w:t>e</w:t>
+            </w:r>
+            <w:r>
+              <w:rPr>
+                <w:rFonts w:cs="Verdana" w:ascii="Verdana" w:hAnsi="Verdana"/>
+                <w:color w:val="000000"/>
+              </w:rPr>
+              <w:t xml:space="preserve">n </w:t>
+            </w:r>
+            <w:r>
+              <w:rPr>
+                <w:rFonts w:cs="Verdana" w:ascii="Verdana" w:hAnsi="Verdana"/>
+                <w:color w:val="000000"/>
+              </w:rPr>
+              <w:t>punktnodefil</w:t>
+            </w:r>
+            <w:r>
+              <w:rPr>
+                <w:rFonts w:cs="Verdana" w:ascii="Verdana" w:hAnsi="Verdana"/>
+                <w:color w:val="000000"/>
+                <w:lang w:val="da-DK"/>
+              </w:rPr>
+              <w:t>.</w:t>
+            </w:r>
+          </w:p>
+          <w:p>
+            <w:pPr>
+              <w:pStyle w:val="Brdtekst"/>
+              <w:widowControl w:val="false"/>
+              <w:suppressAutoHyphens w:val="true"/>
+              <w:spacing w:before="0" w:after="120"/>
+              <w:rPr/>
+            </w:pPr>
+            <w:r>
+              <w:rPr>
+                <w:rFonts w:cs="Verdana" w:ascii="Verdana" w:hAnsi="Verdana"/>
+                <w:color w:val="000000"/>
+                <w:lang w:val="da-DK"/>
+              </w:rPr>
+              <w:t>B</w:t>
+            </w:r>
+            <w:r>
+              <w:rPr>
+                <w:rFonts w:cs="Verdana" w:ascii="Verdana" w:hAnsi="Verdana"/>
+                <w:color w:val="000000"/>
+              </w:rPr>
+              <w:t xml:space="preserve">ruges </w:t>
+            </w:r>
+            <w:r>
+              <w:rPr>
+                <w:rFonts w:cs="Verdana" w:ascii="Verdana" w:hAnsi="Verdana"/>
+                <w:color w:val="000000"/>
+                <w:lang w:val="da-DK"/>
+              </w:rPr>
+              <w:t xml:space="preserve">desuden </w:t>
+            </w:r>
+            <w:r>
+              <w:rPr>
+                <w:rFonts w:cs="Verdana" w:ascii="Verdana" w:hAnsi="Verdana"/>
+                <w:color w:val="000000"/>
+              </w:rPr>
+              <w:t xml:space="preserve">til at aktivere de mange ekstra funktioner, som for eksempel at </w:t>
+            </w:r>
+            <w:r>
+              <w:rPr>
+                <w:rFonts w:cs="Verdana" w:ascii="Verdana" w:hAnsi="Verdana"/>
+                <w:color w:val="000000"/>
+              </w:rPr>
+              <w:t>udskrive punktnodefilen som</w:t>
+            </w:r>
+            <w:r>
+              <w:rPr>
+                <w:rFonts w:cs="Verdana" w:ascii="Verdana" w:hAnsi="Verdana"/>
+                <w:color w:val="000000"/>
+              </w:rPr>
+              <w:t xml:space="preserve"> MusicXml.</w:t>
+            </w:r>
+          </w:p>
+        </w:tc>
+      </w:tr>
+      <w:tr>
+        <w:trPr/>
+        <w:tc>
+          <w:tcPr>
+            <w:tcW w:w="2775" w:type="dxa"/>
+            <w:tcBorders>
+              <w:left w:val="single" w:sz="2" w:space="0" w:color="000000"/>
+              <w:bottom w:val="single" w:sz="2" w:space="0" w:color="000000"/>
+            </w:tcBorders>
+            <w:shd w:fill="auto" w:val="clear"/>
+          </w:tcPr>
+          <w:p>
+            <w:pPr>
+              <w:pStyle w:val="Brdtekst"/>
+              <w:spacing w:before="0" w:after="120"/>
+              <w:rPr/>
+            </w:pPr>
+            <w:r>
+              <w:rPr>
+                <w:rFonts w:cs="Verdana" w:ascii="Verdana" w:hAnsi="Verdana"/>
+                <w:b/>
+                <w:bCs/>
+                <w:color w:val="000000"/>
+              </w:rPr>
+              <w:t>Punktn</w:t>
+            </w:r>
+            <w:r>
+              <w:rPr>
+                <w:rFonts w:cs="Verdana" w:ascii="Verdana" w:hAnsi="Verdana"/>
+                <w:b/>
+                <w:bCs/>
+                <w:color w:val="000000"/>
+              </w:rPr>
+              <w:t>odelisten:</w:t>
+            </w:r>
+          </w:p>
+        </w:tc>
+        <w:tc>
+          <w:tcPr>
+            <w:tcW w:w="6871" w:type="dxa"/>
+            <w:tcBorders>
+              <w:left w:val="single" w:sz="2" w:space="0" w:color="000000"/>
+              <w:bottom w:val="single" w:sz="2" w:space="0" w:color="000000"/>
+              <w:right w:val="single" w:sz="2" w:space="0" w:color="000000"/>
+            </w:tcBorders>
+            <w:shd w:fill="auto" w:val="clear"/>
+          </w:tcPr>
+          <w:p>
+            <w:pPr>
+              <w:pStyle w:val="Normal"/>
+              <w:rPr/>
+            </w:pPr>
+            <w:r>
+              <w:rPr>
+                <w:rFonts w:cs="Verdana" w:ascii="Verdana" w:hAnsi="Verdana"/>
+                <w:color w:val="000000"/>
+              </w:rPr>
+              <w:t xml:space="preserve">Viser den valgte </w:t>
+            </w:r>
+            <w:r>
+              <w:rPr>
+                <w:rFonts w:cs="Verdana" w:ascii="Verdana" w:hAnsi="Verdana"/>
+                <w:color w:val="000000"/>
+              </w:rPr>
+              <w:t>punktnodefil</w:t>
+            </w:r>
+            <w:r>
+              <w:rPr>
+                <w:rFonts w:cs="Verdana" w:ascii="Verdana" w:hAnsi="Verdana"/>
+                <w:color w:val="000000"/>
+              </w:rPr>
+              <w:t xml:space="preserve"> i tekst-repræsentation og punktnode-repræsentation.</w:t>
+            </w:r>
+          </w:p>
+          <w:p>
+            <w:pPr>
+              <w:pStyle w:val="Normal"/>
+              <w:rPr/>
+            </w:pPr>
+            <w:r>
+              <w:rPr>
+                <w:rFonts w:cs="Verdana" w:ascii="Verdana" w:hAnsi="Verdana"/>
+                <w:color w:val="000000"/>
+              </w:rPr>
+              <w:t>Hvis JAWS kører, oplæses desuden den tilsvarende tekst-repræsentation.</w:t>
+            </w:r>
+          </w:p>
+          <w:p>
+            <w:pPr>
+              <w:pStyle w:val="Normal"/>
+              <w:rPr/>
+            </w:pPr>
+            <w:r>
+              <w:rPr>
+                <w:rFonts w:cs="Verdana" w:ascii="Verdana" w:hAnsi="Verdana"/>
+                <w:color w:val="000000"/>
+              </w:rPr>
+              <w:t>Og hvis et Braille-display er tilsluttet, vises både tekst-repræsentation og punktnode-repræsentation dér.</w:t>
+            </w:r>
+          </w:p>
+          <w:p>
+            <w:pPr>
+              <w:pStyle w:val="Brdtekst"/>
+              <w:spacing w:before="0" w:after="120"/>
+              <w:rPr/>
+            </w:pPr>
+            <w:r>
+              <w:rPr>
+                <w:rFonts w:cs="Verdana" w:ascii="Verdana" w:hAnsi="Verdana"/>
+                <w:color w:val="000000"/>
+              </w:rPr>
+              <w:t>Endelig afspilles nodelistens indhold som musik via PC'ens højttalere.</w:t>
+            </w:r>
+          </w:p>
+        </w:tc>
+      </w:tr>
+      <w:tr>
+        <w:trPr/>
+        <w:tc>
+          <w:tcPr>
+            <w:tcW w:w="2775" w:type="dxa"/>
+            <w:tcBorders>
+              <w:left w:val="single" w:sz="2" w:space="0" w:color="000000"/>
+              <w:bottom w:val="single" w:sz="2" w:space="0" w:color="000000"/>
+            </w:tcBorders>
+            <w:shd w:fill="auto" w:val="clear"/>
+          </w:tcPr>
+          <w:p>
+            <w:pPr>
+              <w:pStyle w:val="Brdtekst"/>
+              <w:spacing w:before="0" w:after="120"/>
+              <w:rPr/>
+            </w:pPr>
+            <w:r>
+              <w:rPr>
+                <w:rFonts w:cs="Verdana" w:ascii="Verdana" w:hAnsi="Verdana"/>
+                <w:b/>
+                <w:bCs/>
+                <w:color w:val="000000"/>
+              </w:rPr>
+              <w:t>Statuslinien</w:t>
+            </w:r>
+          </w:p>
+        </w:tc>
+        <w:tc>
+          <w:tcPr>
+            <w:tcW w:w="6871" w:type="dxa"/>
+            <w:tcBorders>
+              <w:left w:val="single" w:sz="2" w:space="0" w:color="000000"/>
+              <w:bottom w:val="single" w:sz="2" w:space="0" w:color="000000"/>
+              <w:right w:val="single" w:sz="2" w:space="0" w:color="000000"/>
+            </w:tcBorders>
+            <w:shd w:fill="auto" w:val="clear"/>
+          </w:tcPr>
+          <w:p>
+            <w:pPr>
+              <w:pStyle w:val="Brdtekst"/>
+              <w:widowControl w:val="false"/>
+              <w:suppressAutoHyphens w:val="true"/>
+              <w:spacing w:before="0" w:after="120"/>
+              <w:rPr/>
+            </w:pPr>
+            <w:r>
+              <w:rPr>
+                <w:rFonts w:cs="Verdana" w:ascii="Verdana" w:hAnsi="Verdana"/>
+                <w:color w:val="000000"/>
+              </w:rPr>
+              <w:t>Endnu ikke implementeret</w:t>
+            </w:r>
+          </w:p>
+        </w:tc>
+      </w:tr>
+      <w:tr>
+        <w:trPr/>
+        <w:tc>
+          <w:tcPr>
+            <w:tcW w:w="2775" w:type="dxa"/>
+            <w:tcBorders>
+              <w:left w:val="single" w:sz="2" w:space="0" w:color="000000"/>
+            </w:tcBorders>
+            <w:shd w:fill="auto" w:val="clear"/>
+          </w:tcPr>
+          <w:p>
+            <w:pPr>
+              <w:pStyle w:val="Brdtekst"/>
+              <w:spacing w:before="0" w:after="120"/>
+              <w:rPr/>
+            </w:pPr>
+            <w:r>
+              <w:rPr>
+                <w:rFonts w:cs="Verdana" w:ascii="Verdana" w:hAnsi="Verdana"/>
+                <w:b/>
+                <w:bCs/>
+                <w:color w:val="000000"/>
+              </w:rPr>
+              <w:t>Punktn</w:t>
+            </w:r>
+            <w:r>
+              <w:rPr>
+                <w:rFonts w:cs="Verdana" w:ascii="Verdana" w:hAnsi="Verdana"/>
+                <w:b/>
+                <w:bCs/>
+                <w:color w:val="000000"/>
+              </w:rPr>
+              <w:t>odefilteret:</w:t>
+            </w:r>
+          </w:p>
+        </w:tc>
+        <w:tc>
+          <w:tcPr>
+            <w:tcW w:w="6871" w:type="dxa"/>
+            <w:tcBorders>
+              <w:left w:val="single" w:sz="2" w:space="0" w:color="000000"/>
+              <w:right w:val="single" w:sz="2" w:space="0" w:color="000000"/>
+            </w:tcBorders>
+            <w:shd w:fill="auto" w:val="clear"/>
+          </w:tcPr>
+          <w:p>
+            <w:pPr>
+              <w:pStyle w:val="Brdtekst"/>
+              <w:spacing w:before="0" w:after="140"/>
+              <w:rPr/>
+            </w:pPr>
+            <w:r>
+              <w:rPr>
+                <w:rFonts w:cs="Verdana" w:ascii="Verdana" w:hAnsi="Verdana"/>
+                <w:color w:val="000000"/>
+              </w:rPr>
+              <w:t>Her kan den viderekomne bruger vælge</w:t>
+            </w:r>
+            <w:r>
+              <w:rPr>
+                <w:rFonts w:cs="Verdana" w:ascii="Verdana" w:hAnsi="Verdana"/>
+                <w:color w:val="000000"/>
+                <w:lang w:val="da-DK"/>
+              </w:rPr>
+              <w:t xml:space="preserve">, </w:t>
+            </w:r>
+            <w:r>
+              <w:rPr>
+                <w:rFonts w:cs="Verdana" w:ascii="Verdana" w:hAnsi="Verdana"/>
+                <w:color w:val="000000"/>
+                <w:lang w:val="da-DK"/>
+              </w:rPr>
+              <w:t>hvordan punktnodefilen skal præsenteres.</w:t>
+            </w:r>
+          </w:p>
+        </w:tc>
+      </w:tr>
+      <w:tr>
+        <w:trPr/>
+        <w:tc>
+          <w:tcPr>
+            <w:tcW w:w="2775" w:type="dxa"/>
+            <w:tcBorders>
+              <w:left w:val="single" w:sz="2" w:space="0" w:color="000000"/>
+              <w:bottom w:val="single" w:sz="2" w:space="0" w:color="000000"/>
+            </w:tcBorders>
+            <w:shd w:fill="auto" w:val="clear"/>
+          </w:tcPr>
+          <w:p>
+            <w:pPr>
+              <w:pStyle w:val="Brdtekst"/>
+              <w:spacing w:before="0" w:after="120"/>
+              <w:rPr/>
+            </w:pPr>
+            <w:r>
+              <w:rPr>
+                <w:rFonts w:cs="Verdana" w:ascii="Verdana" w:hAnsi="Verdana"/>
+                <w:b/>
+                <w:bCs/>
+                <w:color w:val="000000"/>
+              </w:rPr>
+              <w:t>Detaljelisten</w:t>
+            </w:r>
+          </w:p>
+        </w:tc>
+        <w:tc>
+          <w:tcPr>
+            <w:tcW w:w="6871" w:type="dxa"/>
+            <w:tcBorders>
+              <w:left w:val="single" w:sz="2" w:space="0" w:color="000000"/>
+              <w:bottom w:val="single" w:sz="2" w:space="0" w:color="000000"/>
+              <w:right w:val="single" w:sz="2" w:space="0" w:color="000000"/>
+            </w:tcBorders>
+            <w:shd w:fill="auto" w:val="clear"/>
+          </w:tcPr>
+          <w:p>
+            <w:pPr>
+              <w:pStyle w:val="Brdtekst"/>
+              <w:spacing w:before="0" w:after="140"/>
+              <w:rPr/>
+            </w:pPr>
+            <w:r>
+              <w:rPr>
+                <w:rFonts w:cs="Verdana" w:ascii="Verdana" w:hAnsi="Verdana"/>
+                <w:color w:val="000000"/>
+              </w:rPr>
+              <w:t>Endnu ikke implementeret</w:t>
+            </w:r>
+          </w:p>
+        </w:tc>
+      </w:tr>
+    </w:tbl>
+    <w:p>
+      <w:pPr>
+        <w:pStyle w:val="Brdtekst"/>
+        <w:rPr>
+          <w:rFonts w:ascii="Verdana" w:hAnsi="Verdana" w:cs="Verdana"/>
+          <w:color w:val="000000"/>
+        </w:rPr>
+      </w:pPr>
+      <w:r>
+        <w:rPr>
+          <w:rFonts w:cs="Verdana" w:ascii="Verdana" w:hAnsi="Verdana"/>
+          <w:color w:val="000000"/>
+        </w:rPr>
+      </w:r>
+    </w:p>
+    <w:p>
+      <w:pPr>
+        <w:pStyle w:val="Brdtekst"/>
+        <w:rPr>
+          <w:rFonts w:ascii="Verdana" w:hAnsi="Verdana" w:cs="Verdana"/>
+          <w:color w:val="000000"/>
+        </w:rPr>
+      </w:pPr>
+      <w:r>
+        <w:rPr>
+          <w:rFonts w:ascii="Verdana" w:hAnsi="Verdana"/>
+        </w:rPr>
+      </w:r>
+    </w:p>
+    <w:p>
+      <w:pPr>
+        <w:pStyle w:val="Brdtekst"/>
+        <w:rPr>
+          <w:rFonts w:ascii="Verdana" w:hAnsi="Verdana" w:cs="Verdana"/>
+          <w:color w:val="000000"/>
+        </w:rPr>
+      </w:pPr>
+      <w:r>
+        <w:rPr>
+          <w:rFonts w:ascii="Verdana" w:hAnsi="Verdana"/>
+        </w:rPr>
+      </w:r>
+      <w:r>
+        <w:br w:type="page"/>
+      </w:r>
+    </w:p>
+    <w:p>
+      <w:pPr>
+        <w:pStyle w:val="Brdtekst"/>
+        <w:rPr>
+          <w:rFonts w:ascii="Verdana" w:hAnsi="Verdana" w:cs="Verdana"/>
+          <w:color w:val="000000"/>
+        </w:rPr>
+      </w:pPr>
+      <w:r>
+        <w:rPr>
+          <w:rFonts w:cs="Verdana" w:ascii="Verdana" w:hAnsi="Verdana"/>
+          <w:color w:val="000000"/>
+        </w:rPr>
+      </w:r>
+    </w:p>
+    <w:p>
+      <w:pPr>
+        <w:pStyle w:val="Brdtekst"/>
+        <w:rPr/>
+      </w:pPr>
+      <w:r>
+        <w:rPr>
+          <w:rFonts w:cs="Verdana" w:ascii="Verdana" w:hAnsi="Verdana"/>
+          <w:color w:val="000000"/>
+        </w:rPr>
+        <w:t>Som i alle andre Windows-programmer kan man altid:</w:t>
+      </w:r>
+    </w:p>
+    <w:p>
+      <w:pPr>
+        <w:pStyle w:val="Brdtekst"/>
+        <w:numPr>
+          <w:ilvl w:val="0"/>
+          <w:numId w:val="3"/>
+        </w:numPr>
+        <w:rPr/>
+      </w:pPr>
+      <w:r>
+        <w:rPr>
+          <w:rFonts w:cs="Verdana" w:ascii="Verdana" w:hAnsi="Verdana"/>
+          <w:color w:val="000000"/>
+        </w:rPr>
+        <w:t>Aktivere Menulinien ved at trykke på ALT knappen.</w:t>
+      </w:r>
+    </w:p>
+    <w:p>
+      <w:pPr>
+        <w:pStyle w:val="Brdtekst"/>
+        <w:numPr>
+          <w:ilvl w:val="0"/>
+          <w:numId w:val="3"/>
+        </w:numPr>
+        <w:rPr/>
+      </w:pPr>
+      <w:r>
+        <w:rPr>
+          <w:rFonts w:cs="Verdana" w:ascii="Verdana" w:hAnsi="Verdana"/>
+          <w:color w:val="000000"/>
+        </w:rPr>
+        <w:t xml:space="preserve">Skifte mellem de vigtigste visningskomponenter  (i dette tilfælde </w:t>
+      </w:r>
+      <w:r>
+        <w:rPr>
+          <w:rFonts w:cs="Verdana" w:ascii="Verdana" w:hAnsi="Verdana"/>
+          <w:color w:val="000000"/>
+        </w:rPr>
+        <w:t>Punktn</w:t>
+      </w:r>
+      <w:r>
+        <w:rPr>
+          <w:rFonts w:cs="Verdana" w:ascii="Verdana" w:hAnsi="Verdana"/>
+          <w:color w:val="000000"/>
+        </w:rPr>
+        <w:t xml:space="preserve">odelisten og </w:t>
+      </w:r>
+      <w:r>
+        <w:rPr>
+          <w:rFonts w:cs="Verdana" w:ascii="Verdana" w:hAnsi="Verdana"/>
+          <w:color w:val="000000"/>
+        </w:rPr>
+        <w:t>Punktn</w:t>
+      </w:r>
+      <w:r>
+        <w:rPr>
+          <w:rFonts w:cs="Verdana" w:ascii="Verdana" w:hAnsi="Verdana"/>
+          <w:color w:val="000000"/>
+        </w:rPr>
+        <w:t>odefilteret) med TAB knappen.</w:t>
+      </w:r>
+    </w:p>
+    <w:p>
+      <w:pPr>
+        <w:pStyle w:val="Brdtekst"/>
+        <w:numPr>
+          <w:ilvl w:val="0"/>
+          <w:numId w:val="3"/>
+        </w:numPr>
+        <w:rPr/>
+      </w:pPr>
+      <w:r>
+        <w:rPr>
+          <w:rFonts w:cs="Verdana" w:ascii="Verdana" w:hAnsi="Verdana"/>
+          <w:color w:val="000000"/>
+        </w:rPr>
+        <w:t>Afbryde en igangværende handling med ESC knappen.</w:t>
+      </w:r>
+    </w:p>
+    <w:p>
+      <w:pPr>
+        <w:pStyle w:val="Brdtekst"/>
+        <w:numPr>
+          <w:ilvl w:val="0"/>
+          <w:numId w:val="3"/>
+        </w:numPr>
+        <w:rPr/>
+      </w:pPr>
+      <w:r>
+        <w:rPr>
+          <w:rFonts w:cs="Verdana" w:ascii="Verdana" w:hAnsi="Verdana"/>
+          <w:color w:val="000000"/>
+        </w:rPr>
+        <w:t>Lukke programmet med ALT + F4</w:t>
+      </w:r>
+    </w:p>
+    <w:p>
+      <w:pPr>
+        <w:pStyle w:val="Brdtekst"/>
+        <w:rPr>
+          <w:rFonts w:ascii="Verdana" w:hAnsi="Verdana" w:cs="Verdana"/>
+          <w:color w:val="000000"/>
+        </w:rPr>
+      </w:pPr>
+      <w:r>
+        <w:rPr>
+          <w:rFonts w:cs="Verdana" w:ascii="Verdana" w:hAnsi="Verdana"/>
+          <w:color w:val="000000"/>
+        </w:rPr>
+      </w:r>
+    </w:p>
+    <w:p>
+      <w:pPr>
+        <w:pStyle w:val="Brdtekst"/>
+        <w:rPr/>
+      </w:pPr>
+      <w:r>
+        <w:rPr>
+          <w:rFonts w:cs="Verdana" w:ascii="Verdana" w:hAnsi="Verdana"/>
+          <w:color w:val="000000"/>
+        </w:rPr>
+        <w:t>Desuden kan man</w:t>
+      </w:r>
+      <w:r>
+        <w:rPr>
+          <w:rFonts w:cs="Verdana" w:ascii="Verdana" w:hAnsi="Verdana"/>
+          <w:color w:val="000000"/>
+          <w:lang w:val="da-DK"/>
+        </w:rPr>
+        <w:t xml:space="preserve">, </w:t>
+      </w:r>
+      <w:r>
+        <w:rPr>
+          <w:rFonts w:cs="Verdana" w:ascii="Verdana" w:hAnsi="Verdana"/>
+          <w:color w:val="000000"/>
+        </w:rPr>
+        <w:t>hvis JAWS kører</w:t>
+      </w:r>
+      <w:r>
+        <w:rPr>
+          <w:rFonts w:cs="Verdana" w:ascii="Verdana" w:hAnsi="Verdana"/>
+          <w:color w:val="000000"/>
+          <w:lang w:val="da-DK"/>
+        </w:rPr>
+        <w:t>,</w:t>
+      </w:r>
+      <w:r>
+        <w:rPr>
+          <w:rFonts w:cs="Verdana" w:ascii="Verdana" w:hAnsi="Verdana"/>
+          <w:color w:val="000000"/>
+        </w:rPr>
+        <w:t xml:space="preserve"> benytte de gængse JAWS kommandoer</w:t>
+      </w:r>
+      <w:r>
+        <w:rPr>
+          <w:rFonts w:cs="Verdana" w:ascii="Verdana" w:hAnsi="Verdana"/>
+          <w:color w:val="000000"/>
+          <w:lang w:val="da-DK"/>
+        </w:rPr>
+        <w:t>.</w:t>
+      </w:r>
+      <w:r>
+        <w:rPr>
+          <w:rFonts w:cs="Verdana" w:ascii="Verdana" w:hAnsi="Verdana"/>
+          <w:color w:val="000000"/>
+        </w:rPr>
+        <w:t xml:space="preserve"> Man kan blandt andet</w:t>
+      </w:r>
+      <w:r>
+        <w:rPr>
+          <w:rFonts w:cs="Verdana" w:ascii="Verdana" w:hAnsi="Verdana"/>
+          <w:color w:val="000000"/>
+          <w:lang w:val="da-DK"/>
+        </w:rPr>
+        <w:t>:</w:t>
+      </w:r>
+    </w:p>
+    <w:p>
+      <w:pPr>
+        <w:pStyle w:val="Brdtekst"/>
+        <w:numPr>
+          <w:ilvl w:val="0"/>
+          <w:numId w:val="4"/>
+        </w:numPr>
+        <w:rPr/>
+      </w:pPr>
+      <w:r>
+        <w:rPr>
+          <w:rFonts w:cs="Verdana" w:ascii="Verdana" w:hAnsi="Verdana"/>
+          <w:color w:val="000000"/>
+        </w:rPr>
+        <w:t>Få oplæst en meddelelse ved at taste INSERT + B</w:t>
+      </w:r>
+    </w:p>
+    <w:p>
+      <w:pPr>
+        <w:pStyle w:val="Brdtekst"/>
+        <w:numPr>
+          <w:ilvl w:val="0"/>
+          <w:numId w:val="4"/>
+        </w:numPr>
+        <w:rPr/>
+      </w:pPr>
+      <w:r>
+        <w:rPr>
+          <w:rFonts w:cs="Verdana" w:ascii="Verdana" w:hAnsi="Verdana"/>
+          <w:color w:val="000000"/>
+        </w:rPr>
+        <w:t>Slå oplæsning fra/til ved at taste  INSERT + MELLEMRUM efterfulgt af s</w:t>
+      </w:r>
+    </w:p>
+    <w:p>
+      <w:pPr>
+        <w:pStyle w:val="Brdtekst"/>
+        <w:rPr>
+          <w:rFonts w:ascii="Verdana" w:hAnsi="Verdana"/>
+        </w:rPr>
+      </w:pPr>
+      <w:r>
+        <w:rPr>
+          <w:rFonts w:ascii="Verdana" w:hAnsi="Verdana"/>
+        </w:rPr>
+      </w:r>
+    </w:p>
+    <w:p>
+      <w:pPr>
+        <w:pStyle w:val="Overskrift1"/>
+        <w:rPr/>
+      </w:pPr>
+      <w:r>
+        <w:rPr/>
+        <w:t>Håndtering af fejl i punktnodefilen</w:t>
+      </w:r>
+    </w:p>
+    <w:p>
+      <w:pPr>
+        <w:pStyle w:val="Brdtekst"/>
+        <w:rPr>
+          <w:rFonts w:ascii="Verdana" w:hAnsi="Verdana"/>
+        </w:rPr>
+      </w:pPr>
+      <w:r>
+        <w:rPr>
+          <w:rFonts w:ascii="Verdana" w:hAnsi="Verdana"/>
+        </w:rPr>
+        <w:t>Ved indlæsning og fortolkning af punktnodefiler vil der ofte optræde fejl, enten fordi der er fejl i punktnodefilen, eller fordi punktnodefilen indeholder konstruktioner, som  IBOS Punktnodelæser endnu ikke understøtter. I så fald vises efter indlæsning af punktnode-filen en med</w:t>
+      </w:r>
+      <w:r>
+        <w:rPr>
+          <w:rFonts w:ascii="Verdana" w:hAnsi="Verdana"/>
+        </w:rPr>
+        <w:t>d</w:t>
+      </w:r>
+      <w:r>
+        <w:rPr>
+          <w:rFonts w:ascii="Verdana" w:hAnsi="Verdana"/>
+        </w:rPr>
+        <w:t xml:space="preserve">elelse, som opsummerer de fundne fejl. </w:t>
+      </w:r>
+      <w:r>
+        <w:rPr>
+          <w:rFonts w:ascii="Verdana" w:hAnsi="Verdana"/>
+        </w:rPr>
+        <w:t>I de fleste tilfælde kan man blot lukke meddelelsen og gå videre.</w:t>
+      </w:r>
+    </w:p>
+    <w:p>
+      <w:pPr>
+        <w:pStyle w:val="Overskrift1"/>
+        <w:rPr/>
+      </w:pPr>
+      <w:r>
+        <w:rPr/>
+        <w:t>Visning af den indlæste punktnodefil</w:t>
+      </w:r>
+    </w:p>
+    <w:p>
+      <w:pPr>
+        <w:pStyle w:val="Brdtekst"/>
+        <w:rPr>
+          <w:rFonts w:ascii="Verdana" w:hAnsi="Verdana"/>
+        </w:rPr>
+      </w:pPr>
+      <w:r>
+        <w:rPr>
+          <w:rFonts w:ascii="Verdana" w:hAnsi="Verdana"/>
+        </w:rPr>
+      </w:r>
+    </w:p>
+    <w:p>
+      <w:pPr>
+        <w:pStyle w:val="Brdtekst"/>
+        <w:rPr>
+          <w:rFonts w:ascii="Verdana" w:hAnsi="Verdana"/>
+        </w:rPr>
+      </w:pPr>
+      <w:r>
+        <w:rPr>
+          <w:rFonts w:ascii="Verdana" w:hAnsi="Verdana"/>
+        </w:rPr>
+        <w:t xml:space="preserve">Efter indlæsning og fortolkning af en punktnodefil vises dens indhold i en simpel tekstrepræsentation i </w:t>
+      </w:r>
+      <w:r>
+        <w:rPr>
+          <w:rFonts w:ascii="Verdana" w:hAnsi="Verdana"/>
+        </w:rPr>
+        <w:t>Punktnodelisten</w:t>
+      </w:r>
+      <w:r>
+        <w:rPr>
+          <w:rFonts w:ascii="Verdana" w:hAnsi="Verdana"/>
+        </w:rPr>
+        <w:t>:</w:t>
+      </w:r>
+    </w:p>
+    <w:p>
+      <w:pPr>
+        <w:pStyle w:val="Brdtekst"/>
+        <w:rPr>
+          <w:rFonts w:ascii="Verdana" w:hAnsi="Verdana"/>
+        </w:rPr>
+      </w:pPr>
+      <w:r>
+        <w:rPr>
+          <w:rFonts w:ascii="Verdana" w:hAnsi="Verdana"/>
+        </w:rPr>
+        <w:t xml:space="preserve">For hver linje i punktnodefilen vises øverst en linje indeholdende: </w:t>
+      </w:r>
+    </w:p>
+    <w:p>
+      <w:pPr>
+        <w:pStyle w:val="Brdtekst"/>
+        <w:rPr>
+          <w:rFonts w:ascii="Verdana" w:hAnsi="Verdana"/>
+        </w:rPr>
+      </w:pPr>
+      <w:r>
+        <w:rPr>
+          <w:rFonts w:ascii="Verdana" w:hAnsi="Verdana"/>
+        </w:rPr>
         <w:t xml:space="preserve">    • </w:t>
       </w:r>
       <w:r>
-        <w:rPr/>
+        <w:rPr>
+          <w:rFonts w:ascii="Verdana" w:hAnsi="Verdana"/>
+        </w:rPr>
         <w:t>Sidetal (Som almindelig tekst-Braille)</w:t>
       </w:r>
     </w:p>
     <w:p>
       <w:pPr>
-        <w:pStyle w:val="Prformaterettekst"/>
-        <w:bidi w:val="0"/>
-        <w:spacing w:before="0" w:after="0"/>
-        <w:jc w:val="left"/>
-        <w:rPr/>
-      </w:pPr>
-      <w:r>
-        <w:rPr/>
+        <w:pStyle w:val="Brdtekst"/>
+        <w:rPr>
+          <w:rFonts w:ascii="Verdana" w:hAnsi="Verdana"/>
+        </w:rPr>
+      </w:pPr>
+      <w:r>
+        <w:rPr>
+          <w:rFonts w:ascii="Verdana" w:hAnsi="Verdana"/>
+        </w:rPr>
         <w:t xml:space="preserve">    • </w:t>
       </w:r>
       <w:r>
-        <w:rPr/>
+        <w:rPr>
+          <w:rFonts w:ascii="Verdana" w:hAnsi="Verdana"/>
+        </w:rPr>
         <w:t>Linjenummer (Som almindelig tekst-Braille)</w:t>
       </w:r>
     </w:p>
     <w:p>
       <w:pPr>
-        <w:pStyle w:val="Prformaterettekst"/>
-        <w:bidi w:val="0"/>
-        <w:spacing w:before="0" w:after="0"/>
-        <w:jc w:val="left"/>
-        <w:rPr/>
-      </w:pPr>
-      <w:r>
-        <w:rPr/>
+        <w:pStyle w:val="Brdtekst"/>
+        <w:rPr>
+          <w:rFonts w:ascii="Verdana" w:hAnsi="Verdana"/>
+        </w:rPr>
+      </w:pPr>
+      <w:r>
+        <w:rPr>
+          <w:rFonts w:ascii="Verdana" w:hAnsi="Verdana"/>
+        </w:rPr>
         <w:t xml:space="preserve">    • </w:t>
       </w:r>
       <w:r>
-        <w:rPr/>
+        <w:rPr>
+          <w:rFonts w:ascii="Verdana" w:hAnsi="Verdana"/>
+        </w:rPr>
         <w:t>Linjens ufortolkede indhold (som rå Braille symboler)</w:t>
       </w:r>
     </w:p>
     <w:p>
       <w:pPr>
-        <w:pStyle w:val="Prformaterettekst"/>
-        <w:bidi w:val="0"/>
-        <w:spacing w:before="0" w:after="0"/>
-        <w:jc w:val="left"/>
-        <w:rPr/>
-      </w:pPr>
-      <w:r>
-        <w:rPr/>
-      </w:r>
-    </w:p>
-    <w:p>
-      <w:pPr>
-        <w:pStyle w:val="Prformaterettekst"/>
-        <w:bidi w:val="0"/>
-        <w:spacing w:before="0" w:after="0"/>
-        <w:jc w:val="left"/>
-        <w:rPr/>
-      </w:pPr>
-      <w:r>
-        <w:rPr/>
+        <w:pStyle w:val="Brdtekst"/>
+        <w:rPr>
+          <w:rFonts w:ascii="Verdana" w:hAnsi="Verdana"/>
+        </w:rPr>
+      </w:pPr>
+      <w:r>
+        <w:rPr>
+          <w:rFonts w:ascii="Verdana" w:hAnsi="Verdana"/>
+        </w:rPr>
         <w:t>Under denne linje vises et antal linjer, hver indeholdende en tekstbaseret fortolkning af en del af den rå Braille linje. Hver linje indeholder typisk:</w:t>
       </w:r>
     </w:p>
     <w:p>
       <w:pPr>
-        <w:pStyle w:val="Prformaterettekst"/>
-        <w:bidi w:val="0"/>
-        <w:spacing w:before="0" w:after="0"/>
-        <w:jc w:val="left"/>
-        <w:rPr/>
-      </w:pPr>
-      <w:r>
-        <w:rPr/>
-      </w:r>
-    </w:p>
-    <w:p>
-      <w:pPr>
-        <w:pStyle w:val="Prformaterettekst"/>
-        <w:bidi w:val="0"/>
-        <w:spacing w:before="0" w:after="0"/>
-        <w:jc w:val="left"/>
-        <w:rPr/>
-      </w:pPr>
-      <w:r>
-        <w:rPr/>
+        <w:pStyle w:val="Brdtekst"/>
+        <w:rPr>
+          <w:rFonts w:ascii="Verdana" w:hAnsi="Verdana"/>
+        </w:rPr>
+      </w:pPr>
+      <w:r>
+        <w:rPr>
+          <w:rFonts w:ascii="Verdana" w:hAnsi="Verdana"/>
+        </w:rPr>
         <w:t xml:space="preserve">    • </w:t>
       </w:r>
       <w:r>
-        <w:rPr/>
-        <w:t>Dét Braille-symbol, som fortolkes (Som et eller flere rå Braille tegn)</w:t>
-      </w:r>
-    </w:p>
-    <w:p>
-      <w:pPr>
-        <w:pStyle w:val="Prformaterettekst"/>
-        <w:bidi w:val="0"/>
-        <w:spacing w:before="0" w:after="0"/>
-        <w:jc w:val="left"/>
-        <w:rPr/>
-      </w:pPr>
-      <w:r>
-        <w:rPr/>
+        <w:rPr>
+          <w:rFonts w:ascii="Verdana" w:hAnsi="Verdana"/>
+        </w:rPr>
+        <w:t>D</w:t>
+      </w:r>
+      <w:r>
+        <w:rPr>
+          <w:rFonts w:ascii="Verdana" w:hAnsi="Verdana"/>
+        </w:rPr>
+        <w:t>e</w:t>
+      </w:r>
+      <w:r>
+        <w:rPr>
+          <w:rFonts w:ascii="Verdana" w:hAnsi="Verdana"/>
+        </w:rPr>
+        <w:t>t Braille-symbol, som fortolkes (Som et eller flere rå Braille tegn)</w:t>
+      </w:r>
+    </w:p>
+    <w:p>
+      <w:pPr>
+        <w:pStyle w:val="Brdtekst"/>
+        <w:rPr>
+          <w:rFonts w:ascii="Verdana" w:hAnsi="Verdana"/>
+        </w:rPr>
+      </w:pPr>
+      <w:r>
+        <w:rPr>
+          <w:rFonts w:ascii="Verdana" w:hAnsi="Verdana"/>
+        </w:rPr>
         <w:t xml:space="preserve">    • </w:t>
       </w:r>
       <w:r>
-        <w:rPr/>
+        <w:rPr>
+          <w:rFonts w:ascii="Verdana" w:hAnsi="Verdana"/>
+        </w:rPr>
         <w:t>Den fortolkede værdi (Som almindelig tekst)</w:t>
       </w:r>
     </w:p>
     <w:p>
       <w:pPr>
-        <w:pStyle w:val="Prformaterettekst"/>
-        <w:bidi w:val="0"/>
-        <w:spacing w:before="0" w:after="0"/>
-        <w:jc w:val="left"/>
-        <w:rPr/>
-      </w:pPr>
-      <w:r>
-        <w:rPr/>
-      </w:r>
-    </w:p>
-    <w:p>
-      <w:pPr>
-        <w:pStyle w:val="Prformaterettekst"/>
-        <w:bidi w:val="0"/>
-        <w:spacing w:before="0" w:after="0"/>
-        <w:jc w:val="left"/>
-        <w:rPr/>
-      </w:pPr>
-      <w:r>
-        <w:rPr/>
-        <w:t xml:space="preserve">På næste side vises et typisk eksempel på visningen </w:t>
-      </w:r>
-      <w:r>
-        <w:rPr/>
-        <w:t>af starten af ”Højre Hånd”</w:t>
-      </w:r>
-      <w:r>
-        <w:rPr/>
-        <w:t xml:space="preserve"> </w:t>
-      </w:r>
-      <w:r>
-        <w:rPr/>
-        <w:t>for</w:t>
-      </w:r>
-      <w:r>
-        <w:rPr/>
-        <w:t xml:space="preserve"> nummer 262 i Højskolesangbogen: Kaj Munks ”Den blå anemone”.</w:t>
-      </w:r>
-    </w:p>
-    <w:p>
-      <w:pPr>
-        <w:pStyle w:val="Prformaterettekst"/>
-        <w:bidi w:val="0"/>
-        <w:spacing w:before="0" w:after="0"/>
-        <w:jc w:val="left"/>
-        <w:rPr/>
-      </w:pPr>
-      <w:r>
-        <w:rPr/>
-      </w:r>
-    </w:p>
-    <w:p>
-      <w:pPr>
-        <w:pStyle w:val="Prformaterettekst"/>
-        <w:bidi w:val="0"/>
-        <w:spacing w:before="0" w:after="0"/>
-        <w:jc w:val="left"/>
-        <w:rPr/>
-      </w:pPr>
-      <w:r>
-        <w:rPr/>
+        <w:pStyle w:val="Brdtekst"/>
+        <w:rPr>
+          <w:rFonts w:ascii="Verdana" w:hAnsi="Verdana"/>
+        </w:rPr>
+      </w:pPr>
+      <w:r>
+        <w:rPr>
+          <w:rFonts w:ascii="Verdana" w:hAnsi="Verdana"/>
+        </w:rPr>
+      </w:r>
+    </w:p>
+    <w:p>
+      <w:pPr>
+        <w:pStyle w:val="Brdtekst"/>
+        <w:rPr>
+          <w:rFonts w:ascii="Verdana" w:hAnsi="Verdana"/>
+        </w:rPr>
+      </w:pPr>
+      <w:r>
+        <w:rPr>
+          <w:rFonts w:ascii="Verdana" w:hAnsi="Verdana"/>
+        </w:rPr>
+        <w:t>Herunder</w:t>
+      </w:r>
+      <w:r>
+        <w:rPr>
+          <w:rFonts w:ascii="Verdana" w:hAnsi="Verdana"/>
+        </w:rPr>
+        <w:t xml:space="preserve"> vises et typisk eksempel på visninge</w:t>
+      </w:r>
+      <w:r>
+        <w:rPr>
+          <w:rFonts w:ascii="Verdana" w:hAnsi="Verdana"/>
+        </w:rPr>
+        <w:t>n i Punktnodelisten af en indlæst og fortolket punktnodefil. Nemlig fra</w:t>
+      </w:r>
+      <w:r>
+        <w:rPr>
+          <w:rFonts w:ascii="Verdana" w:hAnsi="Verdana"/>
+        </w:rPr>
+        <w:t xml:space="preserve"> af starten af ”Højre Hånd” for nummer 262 i Højskolesangbogen: Kaj Munks ”Den blå anemone”.</w:t>
+      </w:r>
+    </w:p>
+    <w:p>
+      <w:pPr>
+        <w:pStyle w:val="Brdtekst"/>
+        <w:rPr>
+          <w:rFonts w:ascii="Verdana" w:hAnsi="Verdana"/>
+        </w:rPr>
+      </w:pPr>
+      <w:r>
+        <w:rPr>
+          <w:rFonts w:ascii="Verdana" w:hAnsi="Verdana"/>
+        </w:rPr>
+        <w:t>Bemærk at eksemplet både viser eksempler på brug af intervalnotation og bistemmenotation.</w:t>
+      </w:r>
+    </w:p>
+    <w:p>
+      <w:pPr>
+        <w:pStyle w:val="Brdtekst"/>
+        <w:rPr>
+          <w:rFonts w:ascii="Verdana" w:hAnsi="Verdana"/>
+        </w:rPr>
+      </w:pPr>
+      <w:r>
+        <w:rPr>
+          <w:rFonts w:ascii="Verdana" w:hAnsi="Verdana"/>
+        </w:rPr>
+      </w:r>
+    </w:p>
+    <w:p>
+      <w:pPr>
+        <w:pStyle w:val="Brdtekst"/>
+        <w:rPr>
+          <w:rFonts w:ascii="Verdana" w:hAnsi="Verdana"/>
+        </w:rPr>
+      </w:pPr>
+      <w:r>
+        <w:rPr>
+          <w:rFonts w:ascii="Verdana" w:hAnsi="Verdana"/>
+        </w:rPr>
       </w:r>
       <w:r>
         <w:br w:type="page"/>
@@ -2343,6 +3127,10 @@
     <w:p>
       <w:pPr>
         <w:pStyle w:val="Overskrift1"/>
+        <w:numPr>
+          <w:ilvl w:val="0"/>
+          <w:numId w:val="2"/>
+        </w:numPr>
         <w:rPr/>
       </w:pPr>
       <w:r>
@@ -3264,8 +4052,401 @@
       </w:pPr>
     </w:lvl>
   </w:abstractNum>
+  <w:abstractNum w:abstractNumId="2">
+    <w:lvl w:ilvl="0">
+      <w:start w:val="1"/>
+      <w:numFmt w:val="none"/>
+      <w:suff w:val="nothing"/>
+      <w:lvlText w:val=""/>
+      <w:lvlJc w:val="left"/>
+      <w:pPr>
+        <w:ind w:left="0" w:hanging="0"/>
+      </w:pPr>
+    </w:lvl>
+    <w:lvl w:ilvl="1">
+      <w:start w:val="1"/>
+      <w:numFmt w:val="none"/>
+      <w:suff w:val="nothing"/>
+      <w:lvlText w:val=""/>
+      <w:lvlJc w:val="left"/>
+      <w:pPr>
+        <w:ind w:left="0" w:hanging="0"/>
+      </w:pPr>
+    </w:lvl>
+    <w:lvl w:ilvl="2">
+      <w:start w:val="1"/>
+      <w:numFmt w:val="none"/>
+      <w:suff w:val="nothing"/>
+      <w:lvlText w:val=""/>
+      <w:lvlJc w:val="left"/>
+      <w:pPr>
+        <w:ind w:left="0" w:hanging="0"/>
+      </w:pPr>
+    </w:lvl>
+    <w:lvl w:ilvl="3">
+      <w:start w:val="1"/>
+      <w:numFmt w:val="none"/>
+      <w:suff w:val="nothing"/>
+      <w:lvlText w:val=""/>
+      <w:lvlJc w:val="left"/>
+      <w:pPr>
+        <w:ind w:left="0" w:hanging="0"/>
+      </w:pPr>
+    </w:lvl>
+    <w:lvl w:ilvl="4">
+      <w:start w:val="1"/>
+      <w:numFmt w:val="none"/>
+      <w:suff w:val="nothing"/>
+      <w:lvlText w:val=""/>
+      <w:lvlJc w:val="left"/>
+      <w:pPr>
+        <w:ind w:left="0" w:hanging="0"/>
+      </w:pPr>
+    </w:lvl>
+    <w:lvl w:ilvl="5">
+      <w:start w:val="1"/>
+      <w:numFmt w:val="none"/>
+      <w:suff w:val="nothing"/>
+      <w:lvlText w:val=""/>
+      <w:lvlJc w:val="left"/>
+      <w:pPr>
+        <w:ind w:left="0" w:hanging="0"/>
+      </w:pPr>
+    </w:lvl>
+    <w:lvl w:ilvl="6">
+      <w:start w:val="1"/>
+      <w:numFmt w:val="none"/>
+      <w:suff w:val="nothing"/>
+      <w:lvlText w:val=""/>
+      <w:lvlJc w:val="left"/>
+      <w:pPr>
+        <w:ind w:left="0" w:hanging="0"/>
+      </w:pPr>
+    </w:lvl>
+    <w:lvl w:ilvl="7">
+      <w:start w:val="1"/>
+      <w:numFmt w:val="none"/>
+      <w:suff w:val="nothing"/>
+      <w:lvlText w:val=""/>
+      <w:lvlJc w:val="left"/>
+      <w:pPr>
+        <w:ind w:left="0" w:hanging="0"/>
+      </w:pPr>
+    </w:lvl>
+    <w:lvl w:ilvl="8">
+      <w:start w:val="1"/>
+      <w:numFmt w:val="none"/>
+      <w:suff w:val="nothing"/>
+      <w:lvlText w:val=""/>
+      <w:lvlJc w:val="left"/>
+      <w:pPr>
+        <w:ind w:left="0" w:hanging="0"/>
+      </w:pPr>
+    </w:lvl>
+  </w:abstractNum>
+  <w:abstractNum w:abstractNumId="3">
+    <w:lvl w:ilvl="0">
+      <w:start w:val="1"/>
+      <w:numFmt w:val="bullet"/>
+      <w:lvlText w:val=""/>
+      <w:lvlJc w:val="left"/>
+      <w:pPr>
+        <w:tabs>
+          <w:tab w:val="num" w:pos="720"/>
+        </w:tabs>
+        <w:ind w:left="720" w:hanging="360"/>
+      </w:pPr>
+      <w:rPr>
+        <w:rFonts w:ascii="Symbol" w:hAnsi="Symbol" w:cs="Symbol" w:hint="default"/>
+        <w:rFonts w:cs="OpenSymbol"/>
+      </w:rPr>
+    </w:lvl>
+    <w:lvl w:ilvl="1">
+      <w:start w:val="1"/>
+      <w:numFmt w:val="bullet"/>
+      <w:lvlText w:val="◦"/>
+      <w:lvlJc w:val="left"/>
+      <w:pPr>
+        <w:tabs>
+          <w:tab w:val="num" w:pos="1080"/>
+        </w:tabs>
+        <w:ind w:left="1080" w:hanging="360"/>
+      </w:pPr>
+      <w:rPr>
+        <w:rFonts w:ascii="OpenSymbol" w:hAnsi="OpenSymbol" w:cs="OpenSymbol" w:hint="default"/>
+        <w:rFonts w:cs="OpenSymbol"/>
+      </w:rPr>
+    </w:lvl>
+    <w:lvl w:ilvl="2">
+      <w:start w:val="1"/>
+      <w:numFmt w:val="bullet"/>
+      <w:lvlText w:val="▪"/>
+      <w:lvlJc w:val="left"/>
+      <w:pPr>
+        <w:tabs>
+          <w:tab w:val="num" w:pos="1440"/>
+        </w:tabs>
+        <w:ind w:left="1440" w:hanging="360"/>
+      </w:pPr>
+      <w:rPr>
+        <w:rFonts w:ascii="OpenSymbol" w:hAnsi="OpenSymbol" w:cs="OpenSymbol" w:hint="default"/>
+        <w:rFonts w:cs="OpenSymbol"/>
+      </w:rPr>
+    </w:lvl>
+    <w:lvl w:ilvl="3">
+      <w:start w:val="1"/>
+      <w:numFmt w:val="bullet"/>
+      <w:lvlText w:val=""/>
+      <w:lvlJc w:val="left"/>
+      <w:pPr>
+        <w:tabs>
+          <w:tab w:val="num" w:pos="1800"/>
+        </w:tabs>
+        <w:ind w:left="1800" w:hanging="360"/>
+      </w:pPr>
+      <w:rPr>
+        <w:rFonts w:ascii="Symbol" w:hAnsi="Symbol" w:cs="Symbol" w:hint="default"/>
+        <w:rFonts w:cs="OpenSymbol"/>
+      </w:rPr>
+    </w:lvl>
+    <w:lvl w:ilvl="4">
+      <w:start w:val="1"/>
+      <w:numFmt w:val="bullet"/>
+      <w:lvlText w:val="◦"/>
+      <w:lvlJc w:val="left"/>
+      <w:pPr>
+        <w:tabs>
+          <w:tab w:val="num" w:pos="2160"/>
+        </w:tabs>
+        <w:ind w:left="2160" w:hanging="360"/>
+      </w:pPr>
+      <w:rPr>
+        <w:rFonts w:ascii="OpenSymbol" w:hAnsi="OpenSymbol" w:cs="OpenSymbol" w:hint="default"/>
+        <w:rFonts w:cs="OpenSymbol"/>
+      </w:rPr>
+    </w:lvl>
+    <w:lvl w:ilvl="5">
+      <w:start w:val="1"/>
+      <w:numFmt w:val="bullet"/>
+      <w:lvlText w:val="▪"/>
+      <w:lvlJc w:val="left"/>
+      <w:pPr>
+        <w:tabs>
+          <w:tab w:val="num" w:pos="2520"/>
+        </w:tabs>
+        <w:ind w:left="2520" w:hanging="360"/>
+      </w:pPr>
+      <w:rPr>
+        <w:rFonts w:ascii="OpenSymbol" w:hAnsi="OpenSymbol" w:cs="OpenSymbol" w:hint="default"/>
+        <w:rFonts w:cs="OpenSymbol"/>
+      </w:rPr>
+    </w:lvl>
+    <w:lvl w:ilvl="6">
+      <w:start w:val="1"/>
+      <w:numFmt w:val="bullet"/>
+      <w:lvlText w:val=""/>
+      <w:lvlJc w:val="left"/>
+      <w:pPr>
+        <w:tabs>
+          <w:tab w:val="num" w:pos="2880"/>
+        </w:tabs>
+        <w:ind w:left="2880" w:hanging="360"/>
+      </w:pPr>
+      <w:rPr>
+        <w:rFonts w:ascii="Symbol" w:hAnsi="Symbol" w:cs="Symbol" w:hint="default"/>
+        <w:rFonts w:cs="OpenSymbol"/>
+      </w:rPr>
+    </w:lvl>
+    <w:lvl w:ilvl="7">
+      <w:start w:val="1"/>
+      <w:numFmt w:val="bullet"/>
+      <w:lvlText w:val="◦"/>
+      <w:lvlJc w:val="left"/>
+      <w:pPr>
+        <w:tabs>
+          <w:tab w:val="num" w:pos="3240"/>
+        </w:tabs>
+        <w:ind w:left="3240" w:hanging="360"/>
+      </w:pPr>
+      <w:rPr>
+        <w:rFonts w:ascii="OpenSymbol" w:hAnsi="OpenSymbol" w:cs="OpenSymbol" w:hint="default"/>
+        <w:rFonts w:cs="OpenSymbol"/>
+      </w:rPr>
+    </w:lvl>
+    <w:lvl w:ilvl="8">
+      <w:start w:val="1"/>
+      <w:numFmt w:val="bullet"/>
+      <w:lvlText w:val="▪"/>
+      <w:lvlJc w:val="left"/>
+      <w:pPr>
+        <w:tabs>
+          <w:tab w:val="num" w:pos="3600"/>
+        </w:tabs>
+        <w:ind w:left="3600" w:hanging="360"/>
+      </w:pPr>
+      <w:rPr>
+        <w:rFonts w:ascii="OpenSymbol" w:hAnsi="OpenSymbol" w:cs="OpenSymbol" w:hint="default"/>
+        <w:rFonts w:cs="OpenSymbol"/>
+      </w:rPr>
+    </w:lvl>
+  </w:abstractNum>
+  <w:abstractNum w:abstractNumId="4">
+    <w:lvl w:ilvl="0">
+      <w:start w:val="1"/>
+      <w:numFmt w:val="bullet"/>
+      <w:lvlText w:val=""/>
+      <w:lvlJc w:val="left"/>
+      <w:pPr>
+        <w:tabs>
+          <w:tab w:val="num" w:pos="720"/>
+        </w:tabs>
+        <w:ind w:left="720" w:hanging="360"/>
+      </w:pPr>
+      <w:rPr>
+        <w:rFonts w:ascii="Symbol" w:hAnsi="Symbol" w:cs="Symbol" w:hint="default"/>
+        <w:rFonts w:cs="OpenSymbol"/>
+      </w:rPr>
+    </w:lvl>
+    <w:lvl w:ilvl="1">
+      <w:start w:val="1"/>
+      <w:numFmt w:val="bullet"/>
+      <w:lvlText w:val="◦"/>
+      <w:lvlJc w:val="left"/>
+      <w:pPr>
+        <w:tabs>
+          <w:tab w:val="num" w:pos="1080"/>
+        </w:tabs>
+        <w:ind w:left="1080" w:hanging="360"/>
+      </w:pPr>
+      <w:rPr>
+        <w:rFonts w:ascii="OpenSymbol" w:hAnsi="OpenSymbol" w:cs="OpenSymbol" w:hint="default"/>
+        <w:rFonts w:cs="OpenSymbol"/>
+      </w:rPr>
+    </w:lvl>
+    <w:lvl w:ilvl="2">
+      <w:start w:val="1"/>
+      <w:numFmt w:val="bullet"/>
+      <w:lvlText w:val="▪"/>
+      <w:lvlJc w:val="left"/>
+      <w:pPr>
+        <w:tabs>
+          <w:tab w:val="num" w:pos="1440"/>
+        </w:tabs>
+        <w:ind w:left="1440" w:hanging="360"/>
+      </w:pPr>
+      <w:rPr>
+        <w:rFonts w:ascii="OpenSymbol" w:hAnsi="OpenSymbol" w:cs="OpenSymbol" w:hint="default"/>
+        <w:rFonts w:cs="OpenSymbol"/>
+      </w:rPr>
+    </w:lvl>
+    <w:lvl w:ilvl="3">
+      <w:start w:val="1"/>
+      <w:numFmt w:val="bullet"/>
+      <w:lvlText w:val=""/>
+      <w:lvlJc w:val="left"/>
+      <w:pPr>
+        <w:tabs>
+          <w:tab w:val="num" w:pos="1800"/>
+        </w:tabs>
+        <w:ind w:left="1800" w:hanging="360"/>
+      </w:pPr>
+      <w:rPr>
+        <w:rFonts w:ascii="Symbol" w:hAnsi="Symbol" w:cs="Symbol" w:hint="default"/>
+        <w:rFonts w:cs="OpenSymbol"/>
+      </w:rPr>
+    </w:lvl>
+    <w:lvl w:ilvl="4">
+      <w:start w:val="1"/>
+      <w:numFmt w:val="bullet"/>
+      <w:lvlText w:val="◦"/>
+      <w:lvlJc w:val="left"/>
+      <w:pPr>
+        <w:tabs>
+          <w:tab w:val="num" w:pos="2160"/>
+        </w:tabs>
+        <w:ind w:left="2160" w:hanging="360"/>
+      </w:pPr>
+      <w:rPr>
+        <w:rFonts w:ascii="OpenSymbol" w:hAnsi="OpenSymbol" w:cs="OpenSymbol" w:hint="default"/>
+        <w:rFonts w:cs="OpenSymbol"/>
+      </w:rPr>
+    </w:lvl>
+    <w:lvl w:ilvl="5">
+      <w:start w:val="1"/>
+      <w:numFmt w:val="bullet"/>
+      <w:lvlText w:val="▪"/>
+      <w:lvlJc w:val="left"/>
+      <w:pPr>
+        <w:tabs>
+          <w:tab w:val="num" w:pos="2520"/>
+        </w:tabs>
+        <w:ind w:left="2520" w:hanging="360"/>
+      </w:pPr>
+      <w:rPr>
+        <w:rFonts w:ascii="OpenSymbol" w:hAnsi="OpenSymbol" w:cs="OpenSymbol" w:hint="default"/>
+        <w:rFonts w:cs="OpenSymbol"/>
+      </w:rPr>
+    </w:lvl>
+    <w:lvl w:ilvl="6">
+      <w:start w:val="1"/>
+      <w:numFmt w:val="bullet"/>
+      <w:lvlText w:val=""/>
+      <w:lvlJc w:val="left"/>
+      <w:pPr>
+        <w:tabs>
+          <w:tab w:val="num" w:pos="2880"/>
+        </w:tabs>
+        <w:ind w:left="2880" w:hanging="360"/>
+      </w:pPr>
+      <w:rPr>
+        <w:rFonts w:ascii="Symbol" w:hAnsi="Symbol" w:cs="Symbol" w:hint="default"/>
+        <w:rFonts w:cs="OpenSymbol"/>
+      </w:rPr>
+    </w:lvl>
+    <w:lvl w:ilvl="7">
+      <w:start w:val="1"/>
+      <w:numFmt w:val="bullet"/>
+      <w:lvlText w:val="◦"/>
+      <w:lvlJc w:val="left"/>
+      <w:pPr>
+        <w:tabs>
+          <w:tab w:val="num" w:pos="3240"/>
+        </w:tabs>
+        <w:ind w:left="3240" w:hanging="360"/>
+      </w:pPr>
+      <w:rPr>
+        <w:rFonts w:ascii="OpenSymbol" w:hAnsi="OpenSymbol" w:cs="OpenSymbol" w:hint="default"/>
+        <w:rFonts w:cs="OpenSymbol"/>
+      </w:rPr>
+    </w:lvl>
+    <w:lvl w:ilvl="8">
+      <w:start w:val="1"/>
+      <w:numFmt w:val="bullet"/>
+      <w:lvlText w:val="▪"/>
+      <w:lvlJc w:val="left"/>
+      <w:pPr>
+        <w:tabs>
+          <w:tab w:val="num" w:pos="3600"/>
+        </w:tabs>
+        <w:ind w:left="3600" w:hanging="360"/>
+      </w:pPr>
+      <w:rPr>
+        <w:rFonts w:ascii="OpenSymbol" w:hAnsi="OpenSymbol" w:cs="OpenSymbol" w:hint="default"/>
+        <w:rFonts w:cs="OpenSymbol"/>
+      </w:rPr>
+    </w:lvl>
+  </w:abstractNum>
   <w:num w:numId="1">
     <w:abstractNumId w:val="1"/>
+  </w:num>
+  <w:num w:numId="2">
+    <w:abstractNumId w:val="2"/>
+  </w:num>
+  <w:num w:numId="3">
+    <w:abstractNumId w:val="3"/>
+  </w:num>
+  <w:num w:numId="4">
+    <w:abstractNumId w:val="4"/>
   </w:num>
 </w:numbering>
 </file>

</xml_diff>

<commit_message>
Got rid of confusing and unused text
</commit_message>
<xml_diff>
--- a/Documentation/Test descriptions/Version 4.1/Brugervejledning for IBOS Punktnodelæser.v4.1.docx
+++ b/Documentation/Test descriptions/Version 4.1/Brugervejledning for IBOS Punktnodelæser.v4.1.docx
@@ -177,14 +177,14 @@
         </w:tblCellMar>
       </w:tblPr>
       <w:tblGrid>
-        <w:gridCol w:w="2770"/>
-        <w:gridCol w:w="6876"/>
+        <w:gridCol w:w="2769"/>
+        <w:gridCol w:w="6877"/>
       </w:tblGrid>
       <w:tr>
         <w:trPr/>
         <w:tc>
           <w:tcPr>
-            <w:tcW w:w="2770" w:type="dxa"/>
+            <w:tcW w:w="2769" w:type="dxa"/>
             <w:tcBorders>
               <w:top w:val="single" w:sz="2" w:space="0" w:color="000000"/>
               <w:left w:val="single" w:sz="2" w:space="0" w:color="000000"/>
@@ -211,7 +211,7 @@
         </w:tc>
         <w:tc>
           <w:tcPr>
-            <w:tcW w:w="6876" w:type="dxa"/>
+            <w:tcW w:w="6877" w:type="dxa"/>
             <w:tcBorders>
               <w:top w:val="single" w:sz="2" w:space="0" w:color="000000"/>
               <w:left w:val="single" w:sz="2" w:space="0" w:color="000000"/>
@@ -286,7 +286,7 @@
         <w:trPr/>
         <w:tc>
           <w:tcPr>
-            <w:tcW w:w="2770" w:type="dxa"/>
+            <w:tcW w:w="2769" w:type="dxa"/>
             <w:tcBorders>
               <w:left w:val="single" w:sz="2" w:space="0" w:color="000000"/>
               <w:bottom w:val="single" w:sz="2" w:space="0" w:color="000000"/>
@@ -312,7 +312,7 @@
         </w:tc>
         <w:tc>
           <w:tcPr>
-            <w:tcW w:w="6876" w:type="dxa"/>
+            <w:tcW w:w="6877" w:type="dxa"/>
             <w:tcBorders>
               <w:left w:val="single" w:sz="2" w:space="0" w:color="000000"/>
               <w:bottom w:val="single" w:sz="2" w:space="0" w:color="000000"/>
@@ -379,7 +379,7 @@
         <w:trPr/>
         <w:tc>
           <w:tcPr>
-            <w:tcW w:w="2770" w:type="dxa"/>
+            <w:tcW w:w="2769" w:type="dxa"/>
             <w:tcBorders>
               <w:left w:val="single" w:sz="2" w:space="0" w:color="000000"/>
               <w:bottom w:val="single" w:sz="2" w:space="0" w:color="000000"/>
@@ -405,7 +405,7 @@
         </w:tc>
         <w:tc>
           <w:tcPr>
-            <w:tcW w:w="6876" w:type="dxa"/>
+            <w:tcW w:w="6877" w:type="dxa"/>
             <w:tcBorders>
               <w:left w:val="single" w:sz="2" w:space="0" w:color="000000"/>
               <w:bottom w:val="single" w:sz="2" w:space="0" w:color="000000"/>
@@ -435,7 +435,7 @@
         <w:trPr/>
         <w:tc>
           <w:tcPr>
-            <w:tcW w:w="2770" w:type="dxa"/>
+            <w:tcW w:w="2769" w:type="dxa"/>
             <w:tcBorders>
               <w:left w:val="single" w:sz="2" w:space="0" w:color="000000"/>
             </w:tcBorders>
@@ -460,7 +460,7 @@
         </w:tc>
         <w:tc>
           <w:tcPr>
-            <w:tcW w:w="6876" w:type="dxa"/>
+            <w:tcW w:w="6877" w:type="dxa"/>
             <w:tcBorders>
               <w:left w:val="single" w:sz="2" w:space="0" w:color="000000"/>
               <w:right w:val="single" w:sz="2" w:space="0" w:color="000000"/>
@@ -495,7 +495,7 @@
         <w:trPr/>
         <w:tc>
           <w:tcPr>
-            <w:tcW w:w="2770" w:type="dxa"/>
+            <w:tcW w:w="2769" w:type="dxa"/>
             <w:tcBorders>
               <w:left w:val="single" w:sz="2" w:space="0" w:color="000000"/>
               <w:bottom w:val="single" w:sz="2" w:space="0" w:color="000000"/>
@@ -521,7 +521,7 @@
         </w:tc>
         <w:tc>
           <w:tcPr>
-            <w:tcW w:w="6876" w:type="dxa"/>
+            <w:tcW w:w="6877" w:type="dxa"/>
             <w:tcBorders>
               <w:left w:val="single" w:sz="2" w:space="0" w:color="000000"/>
               <w:bottom w:val="single" w:sz="2" w:space="0" w:color="000000"/>
@@ -2843,7 +2843,41 @@
                 <w:szCs w:val="24"/>
                 <w:u w:val="none"/>
               </w:rPr>
-              <w:t xml:space="preserve">⠒⠜⠄ BecifringerChords </w:t>
+              <w:t>⠒⠜⠄ Becifring</w:t>
+            </w:r>
+            <w:r>
+              <w:rPr>
+                <w:b w:val="false"/>
+                <w:bCs w:val="false"/>
+                <w:i w:val="false"/>
+                <w:iCs w:val="false"/>
+                <w:strike w:val="false"/>
+                <w:dstrike w:val="false"/>
+                <w:outline w:val="false"/>
+                <w:shadow w:val="false"/>
+                <w:color w:val="000000"/>
+                <w:sz w:val="24"/>
+                <w:szCs w:val="24"/>
+                <w:u w:val="none"/>
+              </w:rPr>
+              <w:t>er</w:t>
+            </w:r>
+            <w:r>
+              <w:rPr>
+                <w:b w:val="false"/>
+                <w:bCs w:val="false"/>
+                <w:i w:val="false"/>
+                <w:iCs w:val="false"/>
+                <w:strike w:val="false"/>
+                <w:dstrike w:val="false"/>
+                <w:outline w:val="false"/>
+                <w:shadow w:val="false"/>
+                <w:color w:val="000000"/>
+                <w:sz w:val="24"/>
+                <w:szCs w:val="24"/>
+                <w:u w:val="none"/>
+              </w:rPr>
+              <w:t xml:space="preserve"> </w:t>
             </w:r>
           </w:p>
           <w:p>
@@ -3198,15 +3232,15 @@
         </w:tblCellMar>
       </w:tblPr>
       <w:tblGrid>
-        <w:gridCol w:w="1528"/>
+        <w:gridCol w:w="1527"/>
         <w:gridCol w:w="6524"/>
-        <w:gridCol w:w="1593"/>
+        <w:gridCol w:w="1594"/>
       </w:tblGrid>
       <w:tr>
         <w:trPr/>
         <w:tc>
           <w:tcPr>
-            <w:tcW w:w="1528" w:type="dxa"/>
+            <w:tcW w:w="1527" w:type="dxa"/>
             <w:tcBorders>
               <w:top w:val="single" w:sz="4" w:space="0" w:color="000000"/>
               <w:left w:val="single" w:sz="4" w:space="0" w:color="000000"/>
@@ -3310,7 +3344,7 @@
         </w:tc>
         <w:tc>
           <w:tcPr>
-            <w:tcW w:w="1593" w:type="dxa"/>
+            <w:tcW w:w="1594" w:type="dxa"/>
             <w:tcBorders>
               <w:top w:val="single" w:sz="4" w:space="0" w:color="000000"/>
               <w:left w:val="single" w:sz="4" w:space="0" w:color="000000"/>
@@ -3366,7 +3400,7 @@
         <w:trPr/>
         <w:tc>
           <w:tcPr>
-            <w:tcW w:w="1528" w:type="dxa"/>
+            <w:tcW w:w="1527" w:type="dxa"/>
             <w:tcBorders>
               <w:left w:val="single" w:sz="4" w:space="0" w:color="000000"/>
               <w:bottom w:val="single" w:sz="4" w:space="0" w:color="000000"/>
@@ -3469,7 +3503,7 @@
         </w:tc>
         <w:tc>
           <w:tcPr>
-            <w:tcW w:w="1593" w:type="dxa"/>
+            <w:tcW w:w="1594" w:type="dxa"/>
             <w:tcBorders>
               <w:left w:val="single" w:sz="4" w:space="0" w:color="000000"/>
               <w:bottom w:val="single" w:sz="4" w:space="0" w:color="000000"/>
@@ -3524,7 +3558,7 @@
         <w:trPr/>
         <w:tc>
           <w:tcPr>
-            <w:tcW w:w="1528" w:type="dxa"/>
+            <w:tcW w:w="1527" w:type="dxa"/>
             <w:tcBorders>
               <w:left w:val="single" w:sz="4" w:space="0" w:color="000000"/>
               <w:bottom w:val="single" w:sz="4" w:space="0" w:color="000000"/>
@@ -3626,7 +3660,7 @@
         </w:tc>
         <w:tc>
           <w:tcPr>
-            <w:tcW w:w="1593" w:type="dxa"/>
+            <w:tcW w:w="1594" w:type="dxa"/>
             <w:tcBorders>
               <w:left w:val="single" w:sz="4" w:space="0" w:color="000000"/>
               <w:bottom w:val="single" w:sz="4" w:space="0" w:color="000000"/>
@@ -3681,7 +3715,7 @@
         <w:trPr/>
         <w:tc>
           <w:tcPr>
-            <w:tcW w:w="1528" w:type="dxa"/>
+            <w:tcW w:w="1527" w:type="dxa"/>
             <w:tcBorders>
               <w:left w:val="single" w:sz="4" w:space="0" w:color="000000"/>
               <w:bottom w:val="single" w:sz="4" w:space="0" w:color="000000"/>
@@ -3783,7 +3817,7 @@
         </w:tc>
         <w:tc>
           <w:tcPr>
-            <w:tcW w:w="1593" w:type="dxa"/>
+            <w:tcW w:w="1594" w:type="dxa"/>
             <w:tcBorders>
               <w:left w:val="single" w:sz="4" w:space="0" w:color="000000"/>
               <w:bottom w:val="single" w:sz="4" w:space="0" w:color="000000"/>
@@ -5070,14 +5104,14 @@
         </w:tblCellMar>
       </w:tblPr>
       <w:tblGrid>
-        <w:gridCol w:w="2892"/>
-        <w:gridCol w:w="6752"/>
+        <w:gridCol w:w="2891"/>
+        <w:gridCol w:w="6753"/>
       </w:tblGrid>
       <w:tr>
         <w:trPr/>
         <w:tc>
           <w:tcPr>
-            <w:tcW w:w="2892" w:type="dxa"/>
+            <w:tcW w:w="2891" w:type="dxa"/>
             <w:tcBorders>
               <w:top w:val="single" w:sz="4" w:space="0" w:color="000000"/>
               <w:left w:val="single" w:sz="4" w:space="0" w:color="000000"/>
@@ -5131,7 +5165,7 @@
         </w:tc>
         <w:tc>
           <w:tcPr>
-            <w:tcW w:w="6752" w:type="dxa"/>
+            <w:tcW w:w="6753" w:type="dxa"/>
             <w:tcBorders>
               <w:top w:val="single" w:sz="4" w:space="0" w:color="000000"/>
               <w:left w:val="single" w:sz="4" w:space="0" w:color="000000"/>
@@ -5187,7 +5221,7 @@
         <w:trPr/>
         <w:tc>
           <w:tcPr>
-            <w:tcW w:w="2892" w:type="dxa"/>
+            <w:tcW w:w="2891" w:type="dxa"/>
             <w:tcBorders>
               <w:left w:val="single" w:sz="4" w:space="0" w:color="000000"/>
               <w:bottom w:val="single" w:sz="4" w:space="0" w:color="000000"/>
@@ -5240,7 +5274,7 @@
         </w:tc>
         <w:tc>
           <w:tcPr>
-            <w:tcW w:w="6752" w:type="dxa"/>
+            <w:tcW w:w="6753" w:type="dxa"/>
             <w:tcBorders>
               <w:left w:val="single" w:sz="4" w:space="0" w:color="000000"/>
               <w:bottom w:val="single" w:sz="4" w:space="0" w:color="000000"/>
@@ -5365,7 +5399,7 @@
         <w:trPr/>
         <w:tc>
           <w:tcPr>
-            <w:tcW w:w="2892" w:type="dxa"/>
+            <w:tcW w:w="2891" w:type="dxa"/>
             <w:tcBorders>
               <w:left w:val="single" w:sz="4" w:space="0" w:color="000000"/>
               <w:bottom w:val="single" w:sz="4" w:space="0" w:color="000000"/>
@@ -5418,7 +5452,7 @@
         </w:tc>
         <w:tc>
           <w:tcPr>
-            <w:tcW w:w="6752" w:type="dxa"/>
+            <w:tcW w:w="6753" w:type="dxa"/>
             <w:tcBorders>
               <w:left w:val="single" w:sz="4" w:space="0" w:color="000000"/>
               <w:bottom w:val="single" w:sz="4" w:space="0" w:color="000000"/>
@@ -5475,7 +5509,7 @@
         <w:trPr/>
         <w:tc>
           <w:tcPr>
-            <w:tcW w:w="2892" w:type="dxa"/>
+            <w:tcW w:w="2891" w:type="dxa"/>
             <w:tcBorders>
               <w:left w:val="single" w:sz="4" w:space="0" w:color="000000"/>
               <w:bottom w:val="single" w:sz="4" w:space="0" w:color="000000"/>
@@ -5528,7 +5562,7 @@
         </w:tc>
         <w:tc>
           <w:tcPr>
-            <w:tcW w:w="6752" w:type="dxa"/>
+            <w:tcW w:w="6753" w:type="dxa"/>
             <w:tcBorders>
               <w:left w:val="single" w:sz="4" w:space="0" w:color="000000"/>
               <w:bottom w:val="single" w:sz="4" w:space="0" w:color="000000"/>

</xml_diff>